<commit_message>
Clarify Laragon and MySQL in evidence report
</commit_message>
<xml_diff>
--- a/documentacion/Informe_GA8-220501096-AA1-EV01.docx
+++ b/documentacion/Informe_GA8-220501096-AA1-EV01.docx
@@ -379,7 +379,7 @@
     </w:p>
     <w:p>
       <w:r>
-        <w:t>El trabajo conserva la organización del proyecto en capas y paquetes de Java. Las páginas JSP presentan formularios y listados; los Servlets reciben las solicitudes; los servicios validan reglas de negocio; los DAO ejecutan sentencias SQL preparadas; y MySQL conserva los registros. La interfaz se unificó con una hoja de estilos compartida, tomando como referencia el diseño previo de pacientes.</w:t>
+        <w:t>El trabajo conserva la organización del proyecto en capas y paquetes de Java. Las páginas JSP presentan formularios y listados; los Servlets reciben las solicitudes; los servicios validan reglas de negocio; los DAO ejecutan sentencias SQL preparadas; y MySQL conserva los registros; Laragon se utilizó para iniciar y administrar el servicio local de MySQL en Windows. La interfaz se unificó con una hoja de estilos compartida, tomando como referencia el diseño previo de pacientes.</w:t>
       </w:r>
     </w:p>
     <w:p>
@@ -1494,15 +1494,8 @@
             <w:shd w:fill="F5F8FA"/>
           </w:tcPr>
           <w:p>
-            <w:pPr>
-              <w:spacing w:after="40" w:before="40"/>
-            </w:pPr>
             <w:r>
-              <w:rPr>
-                <w:rFonts w:ascii="Arial" w:hAnsi="Arial"/>
-                <w:sz w:val="18"/>
-              </w:rPr>
-              <w:t>MySQL 8.0.30 en Laragon</w:t>
+              <w:t>Laragon</w:t>
             </w:r>
           </w:p>
         </w:tc>
@@ -1519,15 +1512,30 @@
             <w:shd w:fill="F5F8FA"/>
           </w:tcPr>
           <w:p>
-            <w:pPr>
-              <w:spacing w:after="40" w:before="40"/>
-            </w:pPr>
             <w:r>
-              <w:rPr>
-                <w:rFonts w:ascii="Arial" w:hAnsi="Arial"/>
-                <w:sz w:val="18"/>
-              </w:rPr>
-              <w:t>Almacenamiento de pacientes, citas y vacunas en la base ips_vacunacion.</w:t>
+              <w:t>Entorno local usado para iniciar y administrar el servicio MySQL en Windows.</w:t>
+            </w:r>
+          </w:p>
+        </w:tc>
+      </w:tr>
+      <w:tr>
+        <w:tc>
+          <w:tcPr>
+            <w:tcW w:type="dxa" w:w="4997"/>
+          </w:tcPr>
+          <w:p>
+            <w:r>
+              <w:t>MySQL 8.0.30</w:t>
+            </w:r>
+          </w:p>
+        </w:tc>
+        <w:tc>
+          <w:tcPr>
+            <w:tcW w:type="dxa" w:w="4997"/>
+          </w:tcPr>
+          <w:p>
+            <w:r>
+              <w:t>Sistema gestor de base de datos que almacena las tablas paciente, cita y vacuna en ips_vacunacion.</w:t>
             </w:r>
           </w:p>
         </w:tc>

</xml_diff>